<commit_message>
feat: initial AgentOS v1 implementation
</commit_message>
<xml_diff>
--- a/project_structure.docx
+++ b/project_structure.docx
@@ -620,6 +620,170 @@
     <w:p>
       <w:r>
         <w:t xml:space="preserve">      Both use shared packages</w:t>
+      </w:r>
+    </w:p>
+    <w:p/>
+    <w:p/>
+    <w:p>
+      <w:r>
+        <w:t xml:space="preserve">                 Browser / React</w:t>
+      </w:r>
+    </w:p>
+    <w:p>
+      <w:r>
+        <w:t xml:space="preserve">                        │</w:t>
+      </w:r>
+    </w:p>
+    <w:p>
+      <w:r>
+        <w:t xml:space="preserve">                        │ HTTP Request</w:t>
+      </w:r>
+    </w:p>
+    <w:p>
+      <w:r>
+        <w:t xml:space="preserve">                        </w:t>
+      </w:r>
+      <w:r>
+        <w:rPr>
+          <w:rFonts w:ascii="Arial" w:hAnsi="Arial" w:cs="Arial"/>
+        </w:rPr>
+        <w:t>▼</w:t>
+      </w:r>
+    </w:p>
+    <w:p>
+      <w:r>
+        <w:t xml:space="preserve">                Express Route</w:t>
+      </w:r>
+    </w:p>
+    <w:p>
+      <w:r>
+        <w:t xml:space="preserve">                        │</w:t>
+      </w:r>
+    </w:p>
+    <w:p>
+      <w:r>
+        <w:t xml:space="preserve">                        </w:t>
+      </w:r>
+      <w:r>
+        <w:rPr>
+          <w:rFonts w:ascii="Arial" w:hAnsi="Arial" w:cs="Arial"/>
+        </w:rPr>
+        <w:t>▼</w:t>
+      </w:r>
+    </w:p>
+    <w:p>
+      <w:r>
+        <w:t xml:space="preserve">                 Middleware(s)</w:t>
+      </w:r>
+    </w:p>
+    <w:p>
+      <w:r>
+        <w:t xml:space="preserve">         (Security, Authentication,</w:t>
+      </w:r>
+    </w:p>
+    <w:p>
+      <w:r>
+        <w:t xml:space="preserve">          Validation, Logging...)</w:t>
+      </w:r>
+    </w:p>
+    <w:p>
+      <w:r>
+        <w:lastRenderedPageBreak/>
+        <w:t xml:space="preserve">                        │</w:t>
+      </w:r>
+    </w:p>
+    <w:p>
+      <w:r>
+        <w:t xml:space="preserve">                        </w:t>
+      </w:r>
+      <w:r>
+        <w:rPr>
+          <w:rFonts w:ascii="Arial" w:hAnsi="Arial" w:cs="Arial"/>
+        </w:rPr>
+        <w:t>▼</w:t>
+      </w:r>
+    </w:p>
+    <w:p>
+      <w:r>
+        <w:t xml:space="preserve">                 Controller</w:t>
+      </w:r>
+    </w:p>
+    <w:p>
+      <w:r>
+        <w:t xml:space="preserve">          (Receives request and</w:t>
+      </w:r>
+    </w:p>
+    <w:p>
+      <w:r>
+        <w:t xml:space="preserve">           decides what to do)</w:t>
+      </w:r>
+    </w:p>
+    <w:p>
+      <w:r>
+        <w:t xml:space="preserve">                        │</w:t>
+      </w:r>
+    </w:p>
+    <w:p>
+      <w:r>
+        <w:t xml:space="preserve">                        </w:t>
+      </w:r>
+      <w:r>
+        <w:rPr>
+          <w:rFonts w:ascii="Arial" w:hAnsi="Arial" w:cs="Arial"/>
+        </w:rPr>
+        <w:t>▼</w:t>
+      </w:r>
+    </w:p>
+    <w:p>
+      <w:r>
+        <w:t xml:space="preserve">                  Service</w:t>
+      </w:r>
+    </w:p>
+    <w:p>
+      <w:r>
+        <w:t xml:space="preserve">      (Actual business logic lives here)</w:t>
+      </w:r>
+    </w:p>
+    <w:p>
+      <w:r>
+        <w:t xml:space="preserve">                        │</w:t>
+      </w:r>
+    </w:p>
+    <w:p>
+      <w:r>
+        <w:t xml:space="preserve">                        </w:t>
+      </w:r>
+      <w:r>
+        <w:rPr>
+          <w:rFonts w:ascii="Arial" w:hAnsi="Arial" w:cs="Arial"/>
+        </w:rPr>
+        <w:t>▼</w:t>
+      </w:r>
+    </w:p>
+    <w:p>
+      <w:r>
+        <w:t xml:space="preserve">                Database (Drizzle)</w:t>
+      </w:r>
+    </w:p>
+    <w:p>
+      <w:r>
+        <w:t xml:space="preserve">                        │</w:t>
+      </w:r>
+    </w:p>
+    <w:p>
+      <w:r>
+        <w:t xml:space="preserve">                        </w:t>
+      </w:r>
+      <w:r>
+        <w:rPr>
+          <w:rFonts w:ascii="Arial" w:hAnsi="Arial" w:cs="Arial"/>
+        </w:rPr>
+        <w:t>▼</w:t>
+      </w:r>
+    </w:p>
+    <w:p>
+      <w:r>
+        <w:t xml:space="preserve">                   PostgreSQL</w:t>
       </w:r>
     </w:p>
     <w:sectPr>

</xml_diff>